<commit_message>
some file name has been change
</commit_message>
<xml_diff>
--- a/19th_Oct/jUNIT/All about J-Unit.docx
+++ b/19th_Oct/jUNIT/All about J-Unit.docx
@@ -6583,6 +6583,25 @@
           </wp:inline>
         </w:drawing>
       </w:r>
+    </w:p>
+    <w:p>
+      <w:pPr>
+        <w:rPr>
+          <w:sz w:val="24"/>
+          <w:szCs w:val="24"/>
+        </w:rPr>
+      </w:pPr>
+    </w:p>
+    <w:p>
+      <w:pPr>
+        <w:tabs>
+          <w:tab w:val="left" w:pos="1044"/>
+        </w:tabs>
+        <w:rPr>
+          <w:sz w:val="24"/>
+          <w:szCs w:val="24"/>
+        </w:rPr>
+      </w:pPr>
     </w:p>
     <w:sectPr>
       <w:pgSz w:w="11906" w:h="16838"/>

</xml_diff>